<commit_message>
F-09 schema (5 controledata + fysieke looproute) ook in Word-auditbundel 3_Registratieformulieren.docx
Co-Authored-By: Claude Fable 5 <noreply@anthropic.com>
Claude-Session: https://claude.ai/code/session_01FECFWkT7M54srShPFGUQXZ
</commit_message>
<xml_diff>
--- a/06_DEKRA_Audit/Auditdocumenten_Word/3_Registratieformulieren.docx
+++ b/06_DEKRA_Audit/Auditdocumenten_Word/3_Registratieformulieren.docx
@@ -933,6 +933,340 @@
         <w:t xml:space="preserve">Telt ook als bewijs: een foto waarop de vervaldatums leesbaar zijn (de bestandsdatum is je tijdsbewijs), of een appbericht met datumstempel. Een registratie waar overal "0 verlopen" staat is zwakker dan één met een gevonden product en een actie erachter — dat laatste bewijst dat de controle echt is gedaan.</w:t>
       </w:r>
     </w:p>
+    <w:p>
+      <w:pPr>
+        <w:pStyle w:val="Heading1"/>
+        <w:spacing w:after="120"/>
+      </w:pPr>
+      <w:r>
+        <w:rPr>
+          <w:b w:val="0"/>
+        </w:rPr>
+        <w:t>1a · Voorraadcontrole-checklist — schema met 5 data (F-09)</w:t>
+      </w:r>
+    </w:p>
+    <w:p>
+      <w:pPr>
+        <w:pStyle w:val="Heading1"/>
+        <w:spacing w:after="120"/>
+      </w:pPr>
+      <w:r>
+        <w:rPr>
+          <w:b w:val="0"/>
+        </w:rPr>
+        <w:t>Fysieke doorloop per controle: achterste rij en onderste plank van de voorraadkast, behandelkamers, medicatiekoelkast (ook achterin), disposables (steriliteit verpakking), noodset/EpiPen (vervaldatum noteren) en aangebroken flacons (aanbreekdatum, houdbaarheid na aanbreken). Producten die binnen 3 maanden verlopen vooraan zetten (first-expired-first-out). Volledige checklist: F-09 in het kwaliteitssysteem (03_Registraties/Formulieren).</w:t>
+      </w:r>
+    </w:p>
+    <w:tbl>
+      <w:tblPr>
+        <w:tblW w:type="auto" w:w="0"/>
+        <w:tblLook w:firstColumn="1" w:firstRow="1" w:lastColumn="0" w:lastRow="0" w:noHBand="0" w:noVBand="1" w:val="04A0"/>
+      </w:tblPr>
+      <w:tblGrid>
+        <w:gridCol w:w="1928"/>
+        <w:gridCol w:w="1928"/>
+        <w:gridCol w:w="1928"/>
+        <w:gridCol w:w="1928"/>
+        <w:gridCol w:w="1928"/>
+      </w:tblGrid>
+      <w:tr>
+        <w:tc>
+          <w:tcPr>
+            <w:tcW w:type="dxa" w:w="1928"/>
+          </w:tcPr>
+          <w:p>
+            <w:r>
+              <w:rPr>
+                <w:b/>
+              </w:rPr>
+              <w:t>#</w:t>
+            </w:r>
+          </w:p>
+        </w:tc>
+        <w:tc>
+          <w:tcPr>
+            <w:tcW w:type="dxa" w:w="1928"/>
+          </w:tcPr>
+          <w:p>
+            <w:r>
+              <w:rPr>
+                <w:b/>
+              </w:rPr>
+              <w:t>Datum (gepland)</w:t>
+            </w:r>
+          </w:p>
+        </w:tc>
+        <w:tc>
+          <w:tcPr>
+            <w:tcW w:type="dxa" w:w="1928"/>
+          </w:tcPr>
+          <w:p>
+            <w:r>
+              <w:rPr>
+                <w:b/>
+              </w:rPr>
+              <w:t>Datum (uitgevoerd)</w:t>
+            </w:r>
+          </w:p>
+        </w:tc>
+        <w:tc>
+          <w:tcPr>
+            <w:tcW w:type="dxa" w:w="1928"/>
+          </w:tcPr>
+          <w:p>
+            <w:r>
+              <w:rPr>
+                <w:b/>
+              </w:rPr>
+              <w:t>Uitgevoerd door</w:t>
+            </w:r>
+          </w:p>
+        </w:tc>
+        <w:tc>
+          <w:tcPr>
+            <w:tcW w:type="dxa" w:w="1928"/>
+          </w:tcPr>
+          <w:p>
+            <w:r>
+              <w:rPr>
+                <w:b/>
+              </w:rPr>
+              <w:t>Paraaf arts</w:t>
+            </w:r>
+          </w:p>
+        </w:tc>
+      </w:tr>
+      <w:tr>
+        <w:tc>
+          <w:tcPr>
+            <w:tcW w:type="dxa" w:w="1928"/>
+          </w:tcPr>
+          <w:p>
+            <w:r>
+              <w:t>1</w:t>
+            </w:r>
+          </w:p>
+        </w:tc>
+        <w:tc>
+          <w:tcPr>
+            <w:tcW w:type="dxa" w:w="1928"/>
+          </w:tcPr>
+          <w:p>
+            <w:r>
+              <w:t>26-07-2026 (slotcontrole vóór audit)</w:t>
+            </w:r>
+          </w:p>
+        </w:tc>
+        <w:tc>
+          <w:tcPr>
+            <w:tcW w:type="dxa" w:w="1928"/>
+          </w:tcPr>
+          <w:p>
+            <w:r/>
+          </w:p>
+        </w:tc>
+        <w:tc>
+          <w:tcPr>
+            <w:tcW w:type="dxa" w:w="1928"/>
+          </w:tcPr>
+          <w:p>
+            <w:r/>
+          </w:p>
+        </w:tc>
+        <w:tc>
+          <w:tcPr>
+            <w:tcW w:type="dxa" w:w="1928"/>
+          </w:tcPr>
+          <w:p>
+            <w:r/>
+          </w:p>
+        </w:tc>
+      </w:tr>
+      <w:tr>
+        <w:tc>
+          <w:tcPr>
+            <w:tcW w:type="dxa" w:w="1928"/>
+          </w:tcPr>
+          <w:p>
+            <w:r>
+              <w:t>2</w:t>
+            </w:r>
+          </w:p>
+        </w:tc>
+        <w:tc>
+          <w:tcPr>
+            <w:tcW w:type="dxa" w:w="1928"/>
+          </w:tcPr>
+          <w:p>
+            <w:r>
+              <w:t>september 2026 (Q3)</w:t>
+            </w:r>
+          </w:p>
+        </w:tc>
+        <w:tc>
+          <w:tcPr>
+            <w:tcW w:type="dxa" w:w="1928"/>
+          </w:tcPr>
+          <w:p>
+            <w:r/>
+          </w:p>
+        </w:tc>
+        <w:tc>
+          <w:tcPr>
+            <w:tcW w:type="dxa" w:w="1928"/>
+          </w:tcPr>
+          <w:p>
+            <w:r/>
+          </w:p>
+        </w:tc>
+        <w:tc>
+          <w:tcPr>
+            <w:tcW w:type="dxa" w:w="1928"/>
+          </w:tcPr>
+          <w:p>
+            <w:r/>
+          </w:p>
+        </w:tc>
+      </w:tr>
+      <w:tr>
+        <w:tc>
+          <w:tcPr>
+            <w:tcW w:type="dxa" w:w="1928"/>
+          </w:tcPr>
+          <w:p>
+            <w:r>
+              <w:t>3</w:t>
+            </w:r>
+          </w:p>
+        </w:tc>
+        <w:tc>
+          <w:tcPr>
+            <w:tcW w:type="dxa" w:w="1928"/>
+          </w:tcPr>
+          <w:p>
+            <w:r>
+              <w:t>december 2026 (Q4)</w:t>
+            </w:r>
+          </w:p>
+        </w:tc>
+        <w:tc>
+          <w:tcPr>
+            <w:tcW w:type="dxa" w:w="1928"/>
+          </w:tcPr>
+          <w:p>
+            <w:r/>
+          </w:p>
+        </w:tc>
+        <w:tc>
+          <w:tcPr>
+            <w:tcW w:type="dxa" w:w="1928"/>
+          </w:tcPr>
+          <w:p>
+            <w:r/>
+          </w:p>
+        </w:tc>
+        <w:tc>
+          <w:tcPr>
+            <w:tcW w:type="dxa" w:w="1928"/>
+          </w:tcPr>
+          <w:p>
+            <w:r/>
+          </w:p>
+        </w:tc>
+      </w:tr>
+      <w:tr>
+        <w:tc>
+          <w:tcPr>
+            <w:tcW w:type="dxa" w:w="1928"/>
+          </w:tcPr>
+          <w:p>
+            <w:r>
+              <w:t>4</w:t>
+            </w:r>
+          </w:p>
+        </w:tc>
+        <w:tc>
+          <w:tcPr>
+            <w:tcW w:type="dxa" w:w="1928"/>
+          </w:tcPr>
+          <w:p>
+            <w:r>
+              <w:t>maart 2027 (Q1)</w:t>
+            </w:r>
+          </w:p>
+        </w:tc>
+        <w:tc>
+          <w:tcPr>
+            <w:tcW w:type="dxa" w:w="1928"/>
+          </w:tcPr>
+          <w:p>
+            <w:r/>
+          </w:p>
+        </w:tc>
+        <w:tc>
+          <w:tcPr>
+            <w:tcW w:type="dxa" w:w="1928"/>
+          </w:tcPr>
+          <w:p>
+            <w:r/>
+          </w:p>
+        </w:tc>
+        <w:tc>
+          <w:tcPr>
+            <w:tcW w:type="dxa" w:w="1928"/>
+          </w:tcPr>
+          <w:p>
+            <w:r/>
+          </w:p>
+        </w:tc>
+      </w:tr>
+      <w:tr>
+        <w:tc>
+          <w:tcPr>
+            <w:tcW w:type="dxa" w:w="1928"/>
+          </w:tcPr>
+          <w:p>
+            <w:r>
+              <w:t>5</w:t>
+            </w:r>
+          </w:p>
+        </w:tc>
+        <w:tc>
+          <w:tcPr>
+            <w:tcW w:type="dxa" w:w="1928"/>
+          </w:tcPr>
+          <w:p>
+            <w:r>
+              <w:t>juni 2027 (Q2)</w:t>
+            </w:r>
+          </w:p>
+        </w:tc>
+        <w:tc>
+          <w:tcPr>
+            <w:tcW w:type="dxa" w:w="1928"/>
+          </w:tcPr>
+          <w:p>
+            <w:r/>
+          </w:p>
+        </w:tc>
+        <w:tc>
+          <w:tcPr>
+            <w:tcW w:type="dxa" w:w="1928"/>
+          </w:tcPr>
+          <w:p>
+            <w:r/>
+          </w:p>
+        </w:tc>
+        <w:tc>
+          <w:tcPr>
+            <w:tcW w:type="dxa" w:w="1928"/>
+          </w:tcPr>
+          <w:p>
+            <w:r/>
+          </w:p>
+        </w:tc>
+      </w:tr>
+    </w:tbl>
     <w:p>
       <w:r>
         <w:br w:type="page"/>

</xml_diff>